<commit_message>
Se sube el enlace del diagrama de casos de uso
</commit_message>
<xml_diff>
--- a/01-Análisis/01-Requerimientos/Naiapp IEEE.docx
+++ b/01-Análisis/01-Requerimientos/Naiapp IEEE.docx
@@ -343,20 +343,8 @@
           <w:sz w:val="24"/>
           <w:szCs w:val="24"/>
         </w:rPr>
-        <w:t xml:space="preserve">Especificación de Requisitos de Software – </w:t>
+        <w:t>Especificación de Requisitos de Software – NaiApp</w:t>
       </w:r>
-      <w:proofErr w:type="spellStart"/>
-      <w:r>
-        <w:rPr>
-          <w:b/>
-          <w:bCs/>
-          <w:color w:val="000000" w:themeColor="text1"/>
-          <w:sz w:val="24"/>
-          <w:szCs w:val="24"/>
-        </w:rPr>
-        <w:t>NaiApp</w:t>
-      </w:r>
-      <w:proofErr w:type="spellEnd"/>
     </w:p>
     <w:p>
       <w:pPr>
@@ -439,7 +427,6 @@
           <w:szCs w:val="24"/>
         </w:rPr>
       </w:pPr>
-      <w:proofErr w:type="spellStart"/>
       <w:r>
         <w:rPr>
           <w:color w:val="000000" w:themeColor="text1"/>
@@ -448,7 +435,6 @@
         </w:rPr>
         <w:t>Naiapp</w:t>
       </w:r>
-      <w:proofErr w:type="spellEnd"/>
     </w:p>
     <w:p>
       <w:pPr>
@@ -509,24 +495,7 @@
           <w:szCs w:val="24"/>
         </w:rPr>
         <w:br/>
-      </w:r>
-      <w:proofErr w:type="spellStart"/>
-      <w:r>
-        <w:rPr>
-          <w:color w:val="000000" w:themeColor="text1"/>
-          <w:sz w:val="24"/>
-          <w:szCs w:val="24"/>
-        </w:rPr>
-        <w:t>Jhon</w:t>
-      </w:r>
-      <w:proofErr w:type="spellEnd"/>
-      <w:r>
-        <w:rPr>
-          <w:color w:val="000000" w:themeColor="text1"/>
-          <w:sz w:val="24"/>
-          <w:szCs w:val="24"/>
-        </w:rPr>
-        <w:t xml:space="preserve"> Mateus</w:t>
+        <w:t>Jhon Mateus</w:t>
       </w:r>
     </w:p>
     <w:p>
@@ -3092,7 +3061,6 @@
       <w:bookmarkStart w:id="4" w:name="_Toc226989426"/>
       <w:bookmarkEnd w:id="0"/>
       <w:r>
-        <w:lastRenderedPageBreak/>
         <w:t>Introducción</w:t>
       </w:r>
       <w:bookmarkEnd w:id="1"/>
@@ -3177,29 +3145,7 @@
           <w:sz w:val="24"/>
           <w:szCs w:val="24"/>
         </w:rPr>
-        <w:t xml:space="preserve">El propósito de este documento es definir los requisitos del sistema </w:t>
-      </w:r>
-      <w:proofErr w:type="spellStart"/>
-      <w:r>
-        <w:rPr>
-          <w:i/>
-          <w:iCs/>
-          <w:color w:val="000000" w:themeColor="text1"/>
-          <w:sz w:val="24"/>
-          <w:szCs w:val="24"/>
-        </w:rPr>
-        <w:t>NaiApp</w:t>
-      </w:r>
-      <w:proofErr w:type="spellEnd"/>
-      <w:r>
-        <w:rPr>
-          <w:i/>
-          <w:iCs/>
-          <w:color w:val="000000" w:themeColor="text1"/>
-          <w:sz w:val="24"/>
-          <w:szCs w:val="24"/>
-        </w:rPr>
-        <w:t>, una aplicación web orientada a la gestión integral de salones de belleza. Este documento está dirigido al equipo de desarrollo, instructores y partes interesadas.</w:t>
+        <w:t>El propósito de este documento es definir los requisitos del sistema NaiApp, una aplicación web orientada a la gestión integral de salones de belleza. Este documento está dirigido al equipo de desarrollo, instructores y partes interesadas.</w:t>
       </w:r>
     </w:p>
     <w:p>
@@ -3252,7 +3198,6 @@
           <w:szCs w:val="24"/>
         </w:rPr>
       </w:pPr>
-      <w:proofErr w:type="spellStart"/>
       <w:r>
         <w:rPr>
           <w:i/>
@@ -3261,18 +3206,7 @@
           <w:sz w:val="24"/>
           <w:szCs w:val="24"/>
         </w:rPr>
-        <w:t>NaiApp</w:t>
-      </w:r>
-      <w:proofErr w:type="spellEnd"/>
-      <w:r>
-        <w:rPr>
-          <w:i/>
-          <w:iCs/>
-          <w:color w:val="000000" w:themeColor="text1"/>
-          <w:sz w:val="24"/>
-          <w:szCs w:val="24"/>
-        </w:rPr>
-        <w:t xml:space="preserve"> es una plataforma web que permite gestionar citas, usuarios y el control financiero en salones de belleza. El sistema busca optimizar la operatividad del negocio y mejorar la experiencia del cliente mediante la digitalización de procesos.</w:t>
+        <w:t>NaiApp es una plataforma web que permite gestionar citas, usuarios y el control financiero en salones de belleza. El sistema busca optimizar la operatividad del negocio y mejorar la experiencia del cliente mediante la digitalización de procesos.</w:t>
       </w:r>
     </w:p>
     <w:p>
@@ -5028,29 +4962,7 @@
           <w:sz w:val="24"/>
           <w:szCs w:val="24"/>
         </w:rPr>
-        <w:t xml:space="preserve">En él se describen las características del sistema </w:t>
-      </w:r>
-      <w:proofErr w:type="spellStart"/>
-      <w:r>
-        <w:rPr>
-          <w:i/>
-          <w:iCs/>
-          <w:color w:val="000000" w:themeColor="text1"/>
-          <w:sz w:val="24"/>
-          <w:szCs w:val="24"/>
-        </w:rPr>
-        <w:t>NaiApp</w:t>
-      </w:r>
-      <w:proofErr w:type="spellEnd"/>
-      <w:r>
-        <w:rPr>
-          <w:i/>
-          <w:iCs/>
-          <w:color w:val="000000" w:themeColor="text1"/>
-          <w:sz w:val="24"/>
-          <w:szCs w:val="24"/>
-        </w:rPr>
-        <w:t>, sus funcionalidades principales y los requisitos necesarios para su correcto funcionamiento.</w:t>
+        <w:t>En él se describen las características del sistema NaiApp, sus funcionalidades principales y los requisitos necesarios para su correcto funcionamiento.</w:t>
       </w:r>
     </w:p>
     <w:p>
@@ -5144,7 +5056,6 @@
       </w:pPr>
       <w:bookmarkStart w:id="26" w:name="_heading=h.e797da2qi0x5" w:colFirst="0" w:colLast="0"/>
       <w:bookmarkEnd w:id="26"/>
-      <w:proofErr w:type="spellStart"/>
       <w:r>
         <w:rPr>
           <w:i/>
@@ -5153,18 +5064,7 @@
           <w:sz w:val="24"/>
           <w:szCs w:val="24"/>
         </w:rPr>
-        <w:t>NaiApp</w:t>
-      </w:r>
-      <w:proofErr w:type="spellEnd"/>
-      <w:r>
-        <w:rPr>
-          <w:i/>
-          <w:iCs/>
-          <w:color w:val="000000" w:themeColor="text1"/>
-          <w:sz w:val="24"/>
-          <w:szCs w:val="24"/>
-        </w:rPr>
-        <w:t xml:space="preserve"> es una aplicación web independiente que busca reemplazar los métodos manuales de gestión utilizados en salones de belleza, como agendas físicas y registros informales.</w:t>
+        <w:t>NaiApp es una aplicación web independiente que busca reemplazar los métodos manuales de gestión utilizados en salones de belleza, como agendas físicas y registros informales.</w:t>
       </w:r>
     </w:p>
     <w:p>
@@ -5285,31 +5185,7 @@
           <w:szCs w:val="24"/>
           <w:lang w:val="es-CO"/>
         </w:rPr>
-        <w:t xml:space="preserve">El sistema </w:t>
-      </w:r>
-      <w:proofErr w:type="spellStart"/>
-      <w:r>
-        <w:rPr>
-          <w:i/>
-          <w:iCs/>
-          <w:color w:val="000000" w:themeColor="text1"/>
-          <w:sz w:val="24"/>
-          <w:szCs w:val="24"/>
-          <w:lang w:val="es-CO"/>
-        </w:rPr>
-        <w:t>NaiApp</w:t>
-      </w:r>
-      <w:proofErr w:type="spellEnd"/>
-      <w:r>
-        <w:rPr>
-          <w:i/>
-          <w:iCs/>
-          <w:color w:val="000000" w:themeColor="text1"/>
-          <w:sz w:val="24"/>
-          <w:szCs w:val="24"/>
-          <w:lang w:val="es-CO"/>
-        </w:rPr>
-        <w:t xml:space="preserve"> permite gestionar el agendamiento de citas, registro de usuarios, administración de servicios, control de pagos y generación de reportes. Además, incorpora un sistema de calificaciones que permite evaluar la calidad del servicio prestado.</w:t>
+        <w:t>El sistema NaiApp permite gestionar el agendamiento de citas, registro de usuarios, administración de servicios, control de pagos y generación de reportes. Además, incorpora un sistema de calificaciones que permite evaluar la calidad del servicio prestado.</w:t>
       </w:r>
     </w:p>
     <w:p>
@@ -6125,29 +6001,7 @@
           <w:sz w:val="24"/>
           <w:szCs w:val="24"/>
         </w:rPr>
-        <w:t xml:space="preserve">Compatible con computadores, </w:t>
-      </w:r>
-      <w:proofErr w:type="spellStart"/>
-      <w:r>
-        <w:rPr>
-          <w:i/>
-          <w:iCs/>
-          <w:color w:val="000000" w:themeColor="text1"/>
-          <w:sz w:val="24"/>
-          <w:szCs w:val="24"/>
-        </w:rPr>
-        <w:t>tablets</w:t>
-      </w:r>
-      <w:proofErr w:type="spellEnd"/>
-      <w:r>
-        <w:rPr>
-          <w:i/>
-          <w:iCs/>
-          <w:color w:val="000000" w:themeColor="text1"/>
-          <w:sz w:val="24"/>
-          <w:szCs w:val="24"/>
-        </w:rPr>
-        <w:t xml:space="preserve"> y celulares.</w:t>
+        <w:t>Compatible con computadores, tablets y celulares.</w:t>
       </w:r>
     </w:p>
     <w:p>
@@ -6253,7 +6107,6 @@
           <w:szCs w:val="24"/>
         </w:rPr>
       </w:pPr>
-      <w:proofErr w:type="spellStart"/>
       <w:r>
         <w:rPr>
           <w:i/>
@@ -6262,18 +6115,7 @@
           <w:sz w:val="24"/>
           <w:szCs w:val="24"/>
         </w:rPr>
-        <w:t>Backend</w:t>
-      </w:r>
-      <w:proofErr w:type="spellEnd"/>
-      <w:r>
-        <w:rPr>
-          <w:i/>
-          <w:iCs/>
-          <w:color w:val="000000" w:themeColor="text1"/>
-          <w:sz w:val="24"/>
-          <w:szCs w:val="24"/>
-        </w:rPr>
-        <w:t xml:space="preserve"> (Node.js o equivalente)</w:t>
+        <w:t>Backend (Node.js o equivalente)</w:t>
       </w:r>
     </w:p>
     <w:p>
@@ -6962,7 +6804,6 @@
               <w:rPr>
                 <w:color w:val="000000" w:themeColor="text1"/>
               </w:rPr>
-              <w:lastRenderedPageBreak/>
               <w:t>Identificación del requerimiento</w:t>
             </w:r>
           </w:p>
@@ -7918,7 +7759,6 @@
               <w:rPr>
                 <w:color w:val="000000" w:themeColor="text1"/>
               </w:rPr>
-              <w:lastRenderedPageBreak/>
               <w:t>Identificación del requerimiento</w:t>
             </w:r>
           </w:p>
@@ -8925,7 +8765,6 @@
               <w:rPr>
                 <w:color w:val="000000" w:themeColor="text1"/>
               </w:rPr>
-              <w:lastRenderedPageBreak/>
               <w:t>Nombre del requerimiento</w:t>
             </w:r>
           </w:p>
@@ -9881,7 +9720,6 @@
               <w:rPr>
                 <w:color w:val="000000" w:themeColor="text1"/>
               </w:rPr>
-              <w:lastRenderedPageBreak/>
               <w:t>Nombre del requerimiento</w:t>
             </w:r>
           </w:p>
@@ -10841,7 +10679,6 @@
               <w:rPr>
                 <w:color w:val="000000" w:themeColor="text1"/>
               </w:rPr>
-              <w:lastRenderedPageBreak/>
               <w:t>Nombre del requerimiento</w:t>
             </w:r>
           </w:p>
@@ -11795,7 +11632,6 @@
               <w:rPr>
                 <w:color w:val="000000" w:themeColor="text1"/>
               </w:rPr>
-              <w:lastRenderedPageBreak/>
               <w:t>Nombre del requerimiento</w:t>
             </w:r>
           </w:p>
@@ -12761,7 +12597,6 @@
               <w:rPr>
                 <w:color w:val="000000" w:themeColor="text1"/>
               </w:rPr>
-              <w:lastRenderedPageBreak/>
               <w:t>Nombre del requerimiento</w:t>
             </w:r>
           </w:p>
@@ -13723,7 +13558,6 @@
               <w:rPr>
                 <w:color w:val="000000" w:themeColor="text1"/>
               </w:rPr>
-              <w:lastRenderedPageBreak/>
               <w:t>Nombre del requerimiento</w:t>
             </w:r>
           </w:p>
@@ -14208,21 +14042,7 @@
               <w:rPr>
                 <w:color w:val="000000" w:themeColor="text1"/>
               </w:rPr>
-              <w:t xml:space="preserve">El sistema permitirá actualizar la información del perfil del usuario (teléfono, contraseña, </w:t>
-            </w:r>
-            <w:proofErr w:type="spellStart"/>
-            <w:r>
-              <w:rPr>
-                <w:color w:val="000000" w:themeColor="text1"/>
-              </w:rPr>
-              <w:t>etc</w:t>
-            </w:r>
-            <w:proofErr w:type="spellEnd"/>
-            <w:r>
-              <w:rPr>
-                <w:color w:val="000000" w:themeColor="text1"/>
-              </w:rPr>
-              <w:t>).</w:t>
+              <w:t>El sistema permitirá actualizar la información del perfil del usuario (teléfono, contraseña, etc).</w:t>
             </w:r>
           </w:p>
         </w:tc>
@@ -14535,7 +14355,19 @@
               <w:rPr>
                 <w:color w:val="000000" w:themeColor="text1"/>
               </w:rPr>
-              <w:t>El sistema debe permitir el registro de usuarios con sus respectivos roles (como clientes y empleados), mediante sus credenciales (número de documento y contraseña) y el sistema guarda la información en la base de datos.</w:t>
+              <w:t>El sistema debe permitir el registro de usuarios con sus respectivos roles (como clientes y empleados), mediante sus credenciales (</w:t>
+            </w:r>
+            <w:r>
+              <w:rPr>
+                <w:color w:val="000000" w:themeColor="text1"/>
+              </w:rPr>
+              <w:t>correo electrónico</w:t>
+            </w:r>
+            <w:r>
+              <w:rPr>
+                <w:color w:val="000000" w:themeColor="text1"/>
+              </w:rPr>
+              <w:t xml:space="preserve"> y contraseña) y el sistema guarda la información en la base de datos.</w:t>
             </w:r>
           </w:p>
         </w:tc>
@@ -14689,7 +14521,6 @@
               <w:rPr>
                 <w:color w:val="000000" w:themeColor="text1"/>
               </w:rPr>
-              <w:lastRenderedPageBreak/>
               <w:t>Nombre del requerimiento</w:t>
             </w:r>
           </w:p>
@@ -15655,7 +15486,6 @@
               <w:rPr>
                 <w:color w:val="000000" w:themeColor="text1"/>
               </w:rPr>
-              <w:lastRenderedPageBreak/>
               <w:t>Nombre del requerimiento</w:t>
             </w:r>
           </w:p>
@@ -16572,7 +16402,6 @@
           <w:sz w:val="24"/>
           <w:szCs w:val="24"/>
         </w:rPr>
-        <w:lastRenderedPageBreak/>
         <w:t>Encriptación de contraseñas mediante algoritmos seguros</w:t>
       </w:r>
     </w:p>
@@ -16670,42 +16499,8 @@
           <w:sz w:val="24"/>
           <w:szCs w:val="24"/>
         </w:rPr>
-        <w:t xml:space="preserve">Validación de datos tanto en </w:t>
+        <w:t>Validación de datos tanto en frontend como en backend</w:t>
       </w:r>
-      <w:proofErr w:type="spellStart"/>
-      <w:r>
-        <w:rPr>
-          <w:i/>
-          <w:iCs/>
-          <w:color w:val="000000" w:themeColor="text1"/>
-          <w:sz w:val="24"/>
-          <w:szCs w:val="24"/>
-        </w:rPr>
-        <w:t>frontend</w:t>
-      </w:r>
-      <w:proofErr w:type="spellEnd"/>
-      <w:r>
-        <w:rPr>
-          <w:i/>
-          <w:iCs/>
-          <w:color w:val="000000" w:themeColor="text1"/>
-          <w:sz w:val="24"/>
-          <w:szCs w:val="24"/>
-        </w:rPr>
-        <w:t xml:space="preserve"> como en </w:t>
-      </w:r>
-      <w:proofErr w:type="spellStart"/>
-      <w:r>
-        <w:rPr>
-          <w:i/>
-          <w:iCs/>
-          <w:color w:val="000000" w:themeColor="text1"/>
-          <w:sz w:val="24"/>
-          <w:szCs w:val="24"/>
-        </w:rPr>
-        <w:t>backend</w:t>
-      </w:r>
-      <w:proofErr w:type="spellEnd"/>
     </w:p>
     <w:p>
       <w:pPr>
@@ -17062,7 +16857,6 @@
           <w:noProof/>
           <w:color w:val="000000" w:themeColor="text1"/>
         </w:rPr>
-        <w:lastRenderedPageBreak/>
         <w:drawing>
           <wp:inline distT="114300" distB="114300" distL="114300" distR="114300" wp14:anchorId="5B67BB66" wp14:editId="24A2030C">
             <wp:extent cx="5400040" cy="2593045"/>
@@ -17177,7 +16971,6 @@
           <w:noProof/>
           <w:color w:val="000000" w:themeColor="text1"/>
         </w:rPr>
-        <w:lastRenderedPageBreak/>
         <w:drawing>
           <wp:inline distT="114300" distB="114300" distL="114300" distR="114300" wp14:anchorId="40B527AD" wp14:editId="00BFF357">
             <wp:extent cx="5481638" cy="4171950"/>
@@ -17284,7 +17077,6 @@
           <w:noProof/>
           <w:color w:val="000000" w:themeColor="text1"/>
         </w:rPr>
-        <w:lastRenderedPageBreak/>
         <w:drawing>
           <wp:inline distT="114300" distB="114300" distL="114300" distR="114300" wp14:anchorId="0B5D63F7" wp14:editId="18D0BDB8">
             <wp:extent cx="5731200" cy="3873500"/>
@@ -17800,18 +17592,8 @@
               <w:bCs/>
               <w:color w:val="241A61"/>
             </w:rPr>
-            <w:t xml:space="preserve">Especificación de Requisitos de Software – </w:t>
+            <w:t>Especificación de Requisitos de Software – NaiApp</w:t>
           </w:r>
-          <w:proofErr w:type="spellStart"/>
-          <w:r>
-            <w:rPr>
-              <w:b/>
-              <w:bCs/>
-              <w:color w:val="241A61"/>
-            </w:rPr>
-            <w:t>NaiApp</w:t>
-          </w:r>
-          <w:proofErr w:type="spellEnd"/>
         </w:p>
       </w:tc>
       <w:tc>
@@ -22514,28 +22296,28 @@
 </file>
 
 <file path=customXml/item1.xml><?xml version="1.0" encoding="utf-8"?>
+<b:Sources xmlns:b="http://schemas.openxmlformats.org/officeDocument/2006/bibliography" xmlns="http://schemas.openxmlformats.org/officeDocument/2006/bibliography" SelectedStyle="\APASixthEditionOfficeOnline.xsl" StyleName="APA" Version="6"/>
+</file>
+
+<file path=customXml/item2.xml><?xml version="1.0" encoding="utf-8"?>
 <go:gDocsCustomXmlDataStorage xmlns:go="http://customooxmlschemas.google.com/" xmlns:r="http://schemas.openxmlformats.org/officeDocument/2006/relationships" uri="GoogleDocsCustomDataVersion2">
   <go:docsCustomData xmlns:go="http://customooxmlschemas.google.com/" roundtripDataSignature="AMtx7mhyE3aAgRROpd/yQzE29vGMCSHf/w==">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</go:docsCustomData>
 </go:gDocsCustomXmlDataStorage>
 </file>
 
-<file path=customXml/item2.xml><?xml version="1.0" encoding="utf-8"?>
-<b:Sources xmlns:b="http://schemas.openxmlformats.org/officeDocument/2006/bibliography" xmlns="http://schemas.openxmlformats.org/officeDocument/2006/bibliography" SelectedStyle="\APASixthEditionOfficeOnline.xsl" StyleName="APA" Version="6"/>
+<file path=customXml/itemProps1.xml><?xml version="1.0" encoding="utf-8"?>
+<ds:datastoreItem xmlns:ds="http://schemas.openxmlformats.org/officeDocument/2006/customXml" ds:itemID="{BDA58B9A-AE72-4634-A299-C22189427463}">
+  <ds:schemaRefs>
+    <ds:schemaRef ds:uri="http://schemas.openxmlformats.org/officeDocument/2006/bibliography"/>
+  </ds:schemaRefs>
+</ds:datastoreItem>
 </file>
 
-<file path=customXml/itemProps1.xml><?xml version="1.0" encoding="utf-8"?>
+<file path=customXml/itemProps2.xml><?xml version="1.0" encoding="utf-8"?>
 <ds:datastoreItem xmlns:ds="http://schemas.openxmlformats.org/officeDocument/2006/customXml" ds:itemID="{11111111-1234-1234-1234-123412341234}">
   <ds:schemaRefs>
     <ds:schemaRef ds:uri="http://customooxmlschemas.google.com/"/>
     <ds:schemaRef ds:uri="http://schemas.openxmlformats.org/officeDocument/2006/relationships"/>
   </ds:schemaRefs>
 </ds:datastoreItem>
-</file>
-
-<file path=customXml/itemProps2.xml><?xml version="1.0" encoding="utf-8"?>
-<ds:datastoreItem xmlns:ds="http://schemas.openxmlformats.org/officeDocument/2006/customXml" ds:itemID="{BDA58B9A-AE72-4634-A299-C22189427463}">
-  <ds:schemaRefs>
-    <ds:schemaRef ds:uri="http://schemas.openxmlformats.org/officeDocument/2006/bibliography"/>
-  </ds:schemaRefs>
-</ds:datastoreItem>
 </file>
</xml_diff>